<commit_message>
content: two staff-requested lesson updates — the population lesson moves to four 60-minute segments, and the housing lesson becomes a scoring-model task
- p4-hk-population-ai-graph-check (zh + en): the lesson runs as four
  segments of 15/20/18/7 minutes (60 in total). The hook and the
  checking-method step merge into the first segment; nothing else on the
  page changes.
- hk-housing-figures-ai-check (zh + en, page and both Word files): the
  task is now mathematical modelling. Pupils build a scoring model on
  fictional example figures — at most three factors, integer scores from
  1 to 5, three weights adding to 10, one weighted average — and the
  deliverable is the model plus a method review sheet instead of a
  verification table and chart. The source-checking habit, the official
  sources and the citation block stay.
- Both pages move to version 1.1.
</commit_message>
<xml_diff>
--- a/public/files/en/hk-housing-figures-ai-check.docx
+++ b/public/files/en/hk-housing-figures-ai-check.docx
@@ -4,31 +4,53 @@
   <w:body>
     <w:p>
       <w:r>
-        <w:t>Where Hong Kong lives: housing types and living space, checked against official figures (S1-S3 mathematics)</w:t>
+        <w:rPr>
+          <w:b w:val="0"/>
+        </w:rPr>
+        <w:t>Where Hong Kong lives: comparing housing choices with a scoring model (S1-S3 mathematics)</w:t>
       </w:r>
     </w:p>
     <w:p>
       <w:r>
+        <w:rPr>
+          <w:b w:val="0"/>
+        </w:rPr>
         <w:t>──────────────────────────────────────────────</w:t>
       </w:r>
     </w:p>
     <w:p>
       <w:r>
+        <w:rPr>
+          <w:b w:val="0"/>
+        </w:rPr>
         <w:t>姓名 Name: __________  班別 Class: __________  日期 Date: __________</w:t>
       </w:r>
     </w:p>
     <w:p>
       <w:r>
-        <w:t>Key learning area: Mathematics Education   |   Learning elements: data, charts, statistics, measurement, units, comparison, problem-solving</w:t>
+        <w:rPr>
+          <w:b w:val="0"/>
+        </w:rPr>
+        <w:t>Key learning area: Mathematics Education   |   Learning elements: mathematical modelling, data, statistics, measurement, units, comparison, problem-solving</w:t>
       </w:r>
     </w:p>
     <w:p>
       <w:r>
-        <w:t>Points to note when using AI: fact-check — check the living space, the public-versus-private housing shares and the trend claims an AI gives against the official published statistics, and watch for AI hallucinations and data bias. Do not rely on the tool alone.</w:t>
+        <w:rPr>
+          <w:b w:val="0"/>
+        </w:rPr>
+        <w:t>Points to note when using AI: fact-check — an AI can offer factors, scoring rules and figures, but every figure must trace back to a source and be compared with the official published statistics; watch for AI hallucinations and data bias, and never treat a model's result as a fact.</w:t>
       </w:r>
     </w:p>
     <w:p>
+      <w:pPr>
+        <w:spacing w:before="200" w:after="40"/>
+      </w:pPr>
       <w:r>
+        <w:rPr>
+          <w:b/>
+          <w:sz w:val="24"/>
+        </w:rPr>
         <w:t>For the teacher: how to use this worksheet</w:t>
       </w:r>
     </w:p>
@@ -37,7 +59,10 @@
         <w:pStyle w:val="ListBullet"/>
       </w:pPr>
       <w:r>
-        <w:t>Before the lesson: print the worksheet; have graph paper ready, or let pupils plot in a spreadsheet; arrange internet access to the official tables (or project them yourself).</w:t>
+        <w:rPr>
+          <w:b w:val="0"/>
+        </w:rPr>
+        <w:t>Before the lesson: print the worksheet; bring a calculator if you want one; arrange internet access to the official tables (or project them yourself).</w:t>
       </w:r>
     </w:p>
     <w:p>
@@ -45,7 +70,10 @@
         <w:pStyle w:val="ListBullet"/>
       </w:pPr>
       <w:r>
-        <w:t>The answers are not on this worksheet. Pupils obtain each figure themselves from an official source and write down the source and the year — that is what the marking is about.</w:t>
+        <w:rPr>
+          <w:b w:val="0"/>
+        </w:rPr>
+        <w:t>No extra preparation is needed: the four time slots, the formula and the model's limits are all printed here, so the teacher can follow the worksheet in order.</w:t>
       </w:r>
     </w:p>
     <w:p>
@@ -53,7 +81,10 @@
         <w:pStyle w:val="ListBullet"/>
       </w:pPr>
       <w:r>
-        <w:t>Lesson flow: hook (5 min) -&gt; split and label (8 min) -&gt; group checking (15 min) -&gt; redraw the comparison chart (8 min) -&gt; report and close (4 min).</w:t>
+        <w:rPr>
+          <w:b w:val="0"/>
+        </w:rPr>
+        <w:t>Lesson flow: define the model (15 min) -&gt; set the rules and weights (20 min) -&gt; calculate and check (18 min) -&gt; review the method and close (7 min).</w:t>
       </w:r>
     </w:p>
     <w:p>
@@ -61,38 +92,48 @@
         <w:pStyle w:val="ListBullet"/>
       </w:pPr>
       <w:r>
-        <w:t>Remind pupils: the "example account" below is exercise material, not a source. The official tables are what gets checked.</w:t>
+        <w:rPr>
+          <w:b w:val="0"/>
+        </w:rPr>
+        <w:t>There is one formula only: total = (factor one x weight one + factor two x weight two + factor three x weight three) / 10. At most three factors, each scored 1-5 in whole numbers, and the three weights add to 10.</w:t>
+      </w:r>
+    </w:p>
+    <w:p>
+      <w:pPr>
+        <w:pStyle w:val="ListBullet"/>
+      </w:pPr>
+      <w:r>
+        <w:rPr>
+          <w:b w:val="0"/>
+        </w:rPr>
+        <w:t>Remind pupils: the figures below are fictional examples, not a source. To use real figures, take them from the official statistics and record the source and the year.</w:t>
+      </w:r>
+    </w:p>
+    <w:p>
+      <w:pPr>
+        <w:spacing w:before="200" w:after="40"/>
+      </w:pPr>
+      <w:r>
+        <w:rPr>
+          <w:b/>
+          <w:sz w:val="24"/>
+        </w:rPr>
+        <w:t>Part 1: The question and the fictional example figures</w:t>
       </w:r>
     </w:p>
     <w:p>
       <w:r>
-        <w:t>Part 1: The example account (to be checked)</w:t>
-      </w:r>
-    </w:p>
-    <w:p>
-      <w:r>
-        <w:t>Example account (to be checked) — the passage below was written for this exercise as a typical example of what an AI answer looks like. It is not a source: do not quote its figures as facts. To judge it, go to the official tables.</w:t>
-      </w:r>
-    </w:p>
-    <w:p>
-      <w:r>
-        <w:t>"Living space in Hong Kong is a subject people keep coming back to. The average living space per person today is about 16 square metres, far less than Singapore's 30 square metres. There are roughly three million dwellings in Hong Kong, more than half of them private. The public-housing share has fallen steadily since the 1990s and is expected to drop to 30% by 2030. On floor area, the average saleable area of a private flat is about 500 square feet, while a public rental flat averages about 40 square metres. So living conditions in Hong Kong have clearly been improving."</w:t>
-      </w:r>
-    </w:p>
-    <w:p>
-      <w:r>
-        <w:t>Part 2: Checking table</w:t>
-      </w:r>
-    </w:p>
-    <w:p>
-      <w:r>
-        <w:t>One row per sentence. The judgement is one of three only: supported by the official figure / contradicted by it / impossible to check.</w:t>
+        <w:rPr>
+          <w:b w:val="0"/>
+        </w:rPr>
+        <w:t>Three housing options, compared on three things only: space, rent and commute.</w:t>
       </w:r>
     </w:p>
     <w:tbl>
       <w:tblPr>
         <w:tblStyle w:val="TableGrid"/>
         <w:tblW w:type="auto" w:w="0"/>
+        <w:tblLayout w:type="fixed"/>
         <w:tblLook w:firstColumn="1" w:firstRow="1" w:lastColumn="0" w:lastRow="0" w:noHBand="0" w:noVBand="1" w:val="04A0"/>
       </w:tblPr>
       <w:tblGrid>
@@ -104,11 +145,79 @@
       <w:tr>
         <w:tc>
           <w:tcPr>
+            <w:tcW w:type="dxa" w:w="1728"/>
+          </w:tcPr>
+          <w:p>
+            <w:r/>
+            <w:r>
+              <w:rPr>
+                <w:b/>
+              </w:rPr>
+              <w:t>Option</w:t>
+            </w:r>
+          </w:p>
+        </w:tc>
+        <w:tc>
+          <w:tcPr>
+            <w:tcW w:type="dxa" w:w="2880"/>
+          </w:tcPr>
+          <w:p>
+            <w:r/>
+            <w:r>
+              <w:rPr>
+                <w:b/>
+              </w:rPr>
+              <w:t>Usable floor area (m2)</w:t>
+            </w:r>
+          </w:p>
+        </w:tc>
+        <w:tc>
+          <w:tcPr>
             <w:tcW w:type="dxa" w:w="2160"/>
           </w:tcPr>
           <w:p>
+            <w:r/>
             <w:r>
-              <w:t>Sentence (say what it claims)</w:t>
+              <w:rPr>
+                <w:b/>
+              </w:rPr>
+              <w:t>Monthly rent (HK$)</w:t>
+            </w:r>
+          </w:p>
+        </w:tc>
+        <w:tc>
+          <w:tcPr>
+            <w:tcW w:type="dxa" w:w="2160"/>
+          </w:tcPr>
+          <w:p>
+            <w:r/>
+            <w:r>
+              <w:rPr>
+                <w:b/>
+              </w:rPr>
+              <w:t>Daily commute (min)</w:t>
+            </w:r>
+          </w:p>
+        </w:tc>
+      </w:tr>
+      <w:tr>
+        <w:tc>
+          <w:tcPr>
+            <w:tcW w:type="dxa" w:w="1728"/>
+          </w:tcPr>
+          <w:p>
+            <w:r>
+              <w:t>A</w:t>
+            </w:r>
+          </w:p>
+        </w:tc>
+        <w:tc>
+          <w:tcPr>
+            <w:tcW w:type="dxa" w:w="2880"/>
+          </w:tcPr>
+          <w:p>
+            <w:r>
+              <w:t>38</w:t>
             </w:r>
           </w:p>
         </w:tc>
@@ -118,7 +227,7 @@
           </w:tcPr>
           <w:p>
             <w:r>
-              <w:t>Official figure</w:t>
+              <w:t>12,000</w:t>
             </w:r>
           </w:p>
         </w:tc>
@@ -128,7 +237,29 @@
           </w:tcPr>
           <w:p>
             <w:r>
-              <w:t>Source and year</w:t>
+              <w:t>25</w:t>
+            </w:r>
+          </w:p>
+        </w:tc>
+      </w:tr>
+      <w:tr>
+        <w:tc>
+          <w:tcPr>
+            <w:tcW w:type="dxa" w:w="1728"/>
+          </w:tcPr>
+          <w:p>
+            <w:r>
+              <w:t>B</w:t>
+            </w:r>
+          </w:p>
+        </w:tc>
+        <w:tc>
+          <w:tcPr>
+            <w:tcW w:type="dxa" w:w="2880"/>
+          </w:tcPr>
+          <w:p>
+            <w:r>
+              <w:t>45</w:t>
             </w:r>
           </w:p>
         </w:tc>
@@ -138,34 +269,8 @@
           </w:tcPr>
           <w:p>
             <w:r>
-              <w:t>Judgement</w:t>
+              <w:t>15,500</w:t>
             </w:r>
-          </w:p>
-        </w:tc>
-      </w:tr>
-      <w:tr>
-        <w:tc>
-          <w:tcPr>
-            <w:tcW w:type="dxa" w:w="2160"/>
-          </w:tcPr>
-          <w:p>
-            <w:r/>
-          </w:p>
-        </w:tc>
-        <w:tc>
-          <w:tcPr>
-            <w:tcW w:type="dxa" w:w="2160"/>
-          </w:tcPr>
-          <w:p>
-            <w:r/>
-          </w:p>
-        </w:tc>
-        <w:tc>
-          <w:tcPr>
-            <w:tcW w:type="dxa" w:w="2160"/>
-          </w:tcPr>
-          <w:p>
-            <w:r/>
           </w:p>
         </w:tc>
         <w:tc>
@@ -174,7 +279,7 @@
           </w:tcPr>
           <w:p>
             <w:r>
-              <w:t>supported / contradicted / cannot check</w:t>
+              <w:t>40</w:t>
             </w:r>
           </w:p>
         </w:tc>
@@ -182,26 +287,22 @@
       <w:tr>
         <w:tc>
           <w:tcPr>
-            <w:tcW w:type="dxa" w:w="2160"/>
+            <w:tcW w:type="dxa" w:w="1728"/>
           </w:tcPr>
           <w:p>
-            <w:r/>
+            <w:r>
+              <w:t>C</w:t>
+            </w:r>
           </w:p>
         </w:tc>
         <w:tc>
           <w:tcPr>
-            <w:tcW w:type="dxa" w:w="2160"/>
+            <w:tcW w:type="dxa" w:w="2880"/>
           </w:tcPr>
           <w:p>
-            <w:r/>
-          </w:p>
-        </w:tc>
-        <w:tc>
-          <w:tcPr>
-            <w:tcW w:type="dxa" w:w="2160"/>
-          </w:tcPr>
-          <w:p>
-            <w:r/>
+            <w:r>
+              <w:t>32</w:t>
+            </w:r>
           </w:p>
         </w:tc>
         <w:tc>
@@ -210,34 +311,8 @@
           </w:tcPr>
           <w:p>
             <w:r>
-              <w:t>supported / contradicted / cannot check</w:t>
+              <w:t>9,800</w:t>
             </w:r>
-          </w:p>
-        </w:tc>
-      </w:tr>
-      <w:tr>
-        <w:tc>
-          <w:tcPr>
-            <w:tcW w:type="dxa" w:w="2160"/>
-          </w:tcPr>
-          <w:p>
-            <w:r/>
-          </w:p>
-        </w:tc>
-        <w:tc>
-          <w:tcPr>
-            <w:tcW w:type="dxa" w:w="2160"/>
-          </w:tcPr>
-          <w:p>
-            <w:r/>
-          </w:p>
-        </w:tc>
-        <w:tc>
-          <w:tcPr>
-            <w:tcW w:type="dxa" w:w="2160"/>
-          </w:tcPr>
-          <w:p>
-            <w:r/>
           </w:p>
         </w:tc>
         <w:tc>
@@ -246,7 +321,130 @@
           </w:tcPr>
           <w:p>
             <w:r>
-              <w:t>supported / contradicted / cannot check</w:t>
+              <w:t>15</w:t>
+            </w:r>
+          </w:p>
+        </w:tc>
+      </w:tr>
+    </w:tbl>
+    <w:p>
+      <w:r>
+        <w:rPr>
+          <w:b w:val="0"/>
+        </w:rPr>
+        <w:t>Every figure above is a fictional example written for this exercise. None of it describes a real estate, district or market price.</w:t>
+      </w:r>
+    </w:p>
+    <w:p>
+      <w:pPr>
+        <w:spacing w:before="200" w:after="40"/>
+      </w:pPr>
+      <w:r>
+        <w:rPr>
+          <w:b/>
+          <w:sz w:val="24"/>
+        </w:rPr>
+        <w:t>Part 2: Build the scoring model</w:t>
+      </w:r>
+    </w:p>
+    <w:p>
+      <w:r>
+        <w:rPr>
+          <w:b w:val="0"/>
+        </w:rPr>
+        <w:t>Choose at most three factors. For each one, write what 1 and what 5 look like, fill in 2-4 as a class, then share out three weights that add to 10.</w:t>
+      </w:r>
+    </w:p>
+    <w:p>
+      <w:r>
+        <w:rPr>
+          <w:b w:val="0"/>
+        </w:rPr>
+        <w:t>Our modelling question: which option is better overall on ______, ______ and ______?</w:t>
+      </w:r>
+    </w:p>
+    <w:tbl>
+      <w:tblPr>
+        <w:tblStyle w:val="TableGrid"/>
+        <w:tblW w:type="auto" w:w="0"/>
+        <w:tblLayout w:type="fixed"/>
+        <w:tblLook w:firstColumn="1" w:firstRow="1" w:lastColumn="0" w:lastRow="0" w:noHBand="0" w:noVBand="1" w:val="04A0"/>
+      </w:tblPr>
+      <w:tblGrid>
+        <w:gridCol w:w="1728"/>
+        <w:gridCol w:w="1728"/>
+        <w:gridCol w:w="1728"/>
+        <w:gridCol w:w="1728"/>
+        <w:gridCol w:w="1728"/>
+      </w:tblGrid>
+      <w:tr>
+        <w:tc>
+          <w:tcPr>
+            <w:tcW w:type="dxa" w:w="1728"/>
+          </w:tcPr>
+          <w:p>
+            <w:r/>
+            <w:r>
+              <w:rPr>
+                <w:b/>
+              </w:rPr>
+              <w:t>Factor</w:t>
+            </w:r>
+          </w:p>
+        </w:tc>
+        <w:tc>
+          <w:tcPr>
+            <w:tcW w:type="dxa" w:w="1728"/>
+          </w:tcPr>
+          <w:p>
+            <w:r/>
+            <w:r>
+              <w:rPr>
+                <w:b/>
+              </w:rPr>
+              <w:t>1</w:t>
+            </w:r>
+          </w:p>
+        </w:tc>
+        <w:tc>
+          <w:tcPr>
+            <w:tcW w:type="dxa" w:w="1728"/>
+          </w:tcPr>
+          <w:p>
+            <w:r/>
+            <w:r>
+              <w:rPr>
+                <w:b/>
+              </w:rPr>
+              <w:t>3</w:t>
+            </w:r>
+          </w:p>
+        </w:tc>
+        <w:tc>
+          <w:tcPr>
+            <w:tcW w:type="dxa" w:w="1728"/>
+          </w:tcPr>
+          <w:p>
+            <w:r/>
+            <w:r>
+              <w:rPr>
+                <w:b/>
+              </w:rPr>
+              <w:t>5</w:t>
+            </w:r>
+          </w:p>
+        </w:tc>
+        <w:tc>
+          <w:tcPr>
+            <w:tcW w:type="dxa" w:w="1728"/>
+          </w:tcPr>
+          <w:p>
+            <w:r/>
+            <w:r>
+              <w:rPr>
+                <w:b/>
+              </w:rPr>
+              <w:t>Weight</w:t>
             </w:r>
           </w:p>
         </w:tc>
@@ -254,7 +452,7 @@
       <w:tr>
         <w:tc>
           <w:tcPr>
-            <w:tcW w:type="dxa" w:w="2160"/>
+            <w:tcW w:type="dxa" w:w="1728"/>
           </w:tcPr>
           <w:p>
             <w:r/>
@@ -262,7 +460,7 @@
         </w:tc>
         <w:tc>
           <w:tcPr>
-            <w:tcW w:type="dxa" w:w="2160"/>
+            <w:tcW w:type="dxa" w:w="1728"/>
           </w:tcPr>
           <w:p>
             <w:r/>
@@ -270,7 +468,7 @@
         </w:tc>
         <w:tc>
           <w:tcPr>
-            <w:tcW w:type="dxa" w:w="2160"/>
+            <w:tcW w:type="dxa" w:w="1728"/>
           </w:tcPr>
           <w:p>
             <w:r/>
@@ -278,11 +476,231 @@
         </w:tc>
         <w:tc>
           <w:tcPr>
-            <w:tcW w:type="dxa" w:w="2160"/>
+            <w:tcW w:type="dxa" w:w="1728"/>
           </w:tcPr>
           <w:p>
+            <w:r/>
+          </w:p>
+        </w:tc>
+        <w:tc>
+          <w:tcPr>
+            <w:tcW w:type="dxa" w:w="1728"/>
+          </w:tcPr>
+          <w:p>
+            <w:r/>
+          </w:p>
+        </w:tc>
+      </w:tr>
+      <w:tr>
+        <w:tc>
+          <w:tcPr>
+            <w:tcW w:type="dxa" w:w="1728"/>
+          </w:tcPr>
+          <w:p>
+            <w:r/>
+          </w:p>
+        </w:tc>
+        <w:tc>
+          <w:tcPr>
+            <w:tcW w:type="dxa" w:w="1728"/>
+          </w:tcPr>
+          <w:p>
+            <w:r/>
+          </w:p>
+        </w:tc>
+        <w:tc>
+          <w:tcPr>
+            <w:tcW w:type="dxa" w:w="1728"/>
+          </w:tcPr>
+          <w:p>
+            <w:r/>
+          </w:p>
+        </w:tc>
+        <w:tc>
+          <w:tcPr>
+            <w:tcW w:type="dxa" w:w="1728"/>
+          </w:tcPr>
+          <w:p>
+            <w:r/>
+          </w:p>
+        </w:tc>
+        <w:tc>
+          <w:tcPr>
+            <w:tcW w:type="dxa" w:w="1728"/>
+          </w:tcPr>
+          <w:p>
+            <w:r/>
+          </w:p>
+        </w:tc>
+      </w:tr>
+      <w:tr>
+        <w:tc>
+          <w:tcPr>
+            <w:tcW w:type="dxa" w:w="1728"/>
+          </w:tcPr>
+          <w:p>
+            <w:r/>
+          </w:p>
+        </w:tc>
+        <w:tc>
+          <w:tcPr>
+            <w:tcW w:type="dxa" w:w="1728"/>
+          </w:tcPr>
+          <w:p>
+            <w:r/>
+          </w:p>
+        </w:tc>
+        <w:tc>
+          <w:tcPr>
+            <w:tcW w:type="dxa" w:w="1728"/>
+          </w:tcPr>
+          <w:p>
+            <w:r/>
+          </w:p>
+        </w:tc>
+        <w:tc>
+          <w:tcPr>
+            <w:tcW w:type="dxa" w:w="1728"/>
+          </w:tcPr>
+          <w:p>
+            <w:r/>
+          </w:p>
+        </w:tc>
+        <w:tc>
+          <w:tcPr>
+            <w:tcW w:type="dxa" w:w="1728"/>
+          </w:tcPr>
+          <w:p>
+            <w:r/>
+          </w:p>
+        </w:tc>
+      </w:tr>
+    </w:tbl>
+    <w:p>
+      <w:r>
+        <w:rPr>
+          <w:b w:val="0"/>
+        </w:rPr>
+        <w:t>Check: at most three factors? Whole numbers from 1 to 5 at every level? Three weights adding to 10?   Yes / No</w:t>
+      </w:r>
+    </w:p>
+    <w:p>
+      <w:pPr>
+        <w:spacing w:before="200" w:after="40"/>
+      </w:pPr>
+      <w:r>
+        <w:rPr>
+          <w:b/>
+          <w:sz w:val="24"/>
+        </w:rPr>
+        <w:t>Part 3: Calculate the totals</w:t>
+      </w:r>
+    </w:p>
+    <w:p>
+      <w:r>
+        <w:rPr>
+          <w:b w:val="0"/>
+        </w:rPr>
+        <w:t>Total = (factor one x weight one + factor two x weight two + factor three x weight three) / 10</w:t>
+      </w:r>
+    </w:p>
+    <w:tbl>
+      <w:tblPr>
+        <w:tblStyle w:val="TableGrid"/>
+        <w:tblW w:type="auto" w:w="0"/>
+        <w:tblLayout w:type="fixed"/>
+        <w:tblLook w:firstColumn="1" w:firstRow="1" w:lastColumn="0" w:lastRow="0" w:noHBand="0" w:noVBand="1" w:val="04A0"/>
+      </w:tblPr>
+      <w:tblGrid>
+        <w:gridCol w:w="1440"/>
+        <w:gridCol w:w="1440"/>
+        <w:gridCol w:w="1440"/>
+        <w:gridCol w:w="1440"/>
+        <w:gridCol w:w="1440"/>
+        <w:gridCol w:w="1440"/>
+      </w:tblGrid>
+      <w:tr>
+        <w:tc>
+          <w:tcPr>
+            <w:tcW w:type="dxa" w:w="960"/>
+          </w:tcPr>
+          <w:p>
+            <w:r/>
             <w:r>
-              <w:t>supported / contradicted / cannot check</w:t>
+              <w:rPr>
+                <w:b/>
+              </w:rPr>
+              <w:t>Option</w:t>
+            </w:r>
+          </w:p>
+        </w:tc>
+        <w:tc>
+          <w:tcPr>
+            <w:tcW w:type="dxa" w:w="1440"/>
+          </w:tcPr>
+          <w:p>
+            <w:r/>
+            <w:r>
+              <w:rPr>
+                <w:b/>
+              </w:rPr>
+              <w:t>Factor one (score x weight)</w:t>
+            </w:r>
+          </w:p>
+        </w:tc>
+        <w:tc>
+          <w:tcPr>
+            <w:tcW w:type="dxa" w:w="1440"/>
+          </w:tcPr>
+          <w:p>
+            <w:r/>
+            <w:r>
+              <w:rPr>
+                <w:b/>
+              </w:rPr>
+              <w:t>Factor two (score x weight)</w:t>
+            </w:r>
+          </w:p>
+        </w:tc>
+        <w:tc>
+          <w:tcPr>
+            <w:tcW w:type="dxa" w:w="1440"/>
+          </w:tcPr>
+          <w:p>
+            <w:r/>
+            <w:r>
+              <w:rPr>
+                <w:b/>
+              </w:rPr>
+              <w:t>Factor three (score x weight)</w:t>
+            </w:r>
+          </w:p>
+        </w:tc>
+        <w:tc>
+          <w:tcPr>
+            <w:tcW w:type="dxa" w:w="960"/>
+          </w:tcPr>
+          <w:p>
+            <w:r/>
+            <w:r>
+              <w:rPr>
+                <w:b/>
+              </w:rPr>
+              <w:t>Total</w:t>
+            </w:r>
+          </w:p>
+        </w:tc>
+        <w:tc>
+          <w:tcPr>
+            <w:tcW w:type="dxa" w:w="960"/>
+          </w:tcPr>
+          <w:p>
+            <w:r/>
+            <w:r>
+              <w:rPr>
+                <w:b/>
+              </w:rPr>
+              <w:t>Rank</w:t>
             </w:r>
           </w:p>
         </w:tc>
@@ -290,7 +708,17 @@
       <w:tr>
         <w:tc>
           <w:tcPr>
-            <w:tcW w:type="dxa" w:w="2160"/>
+            <w:tcW w:type="dxa" w:w="960"/>
+          </w:tcPr>
+          <w:p>
+            <w:r>
+              <w:t>A</w:t>
+            </w:r>
+          </w:p>
+        </w:tc>
+        <w:tc>
+          <w:tcPr>
+            <w:tcW w:type="dxa" w:w="1440"/>
           </w:tcPr>
           <w:p>
             <w:r/>
@@ -298,7 +726,7 @@
         </w:tc>
         <w:tc>
           <w:tcPr>
-            <w:tcW w:type="dxa" w:w="2160"/>
+            <w:tcW w:type="dxa" w:w="1440"/>
           </w:tcPr>
           <w:p>
             <w:r/>
@@ -306,7 +734,7 @@
         </w:tc>
         <w:tc>
           <w:tcPr>
-            <w:tcW w:type="dxa" w:w="2160"/>
+            <w:tcW w:type="dxa" w:w="1440"/>
           </w:tcPr>
           <w:p>
             <w:r/>
@@ -314,19 +742,7 @@
         </w:tc>
         <w:tc>
           <w:tcPr>
-            <w:tcW w:type="dxa" w:w="2160"/>
-          </w:tcPr>
-          <w:p>
-            <w:r>
-              <w:t>supported / contradicted / cannot check</w:t>
-            </w:r>
-          </w:p>
-        </w:tc>
-      </w:tr>
-      <w:tr>
-        <w:tc>
-          <w:tcPr>
-            <w:tcW w:type="dxa" w:w="2160"/>
+            <w:tcW w:type="dxa" w:w="960"/>
           </w:tcPr>
           <w:p>
             <w:r/>
@@ -334,7 +750,27 @@
         </w:tc>
         <w:tc>
           <w:tcPr>
-            <w:tcW w:type="dxa" w:w="2160"/>
+            <w:tcW w:type="dxa" w:w="960"/>
+          </w:tcPr>
+          <w:p>
+            <w:r/>
+          </w:p>
+        </w:tc>
+      </w:tr>
+      <w:tr>
+        <w:tc>
+          <w:tcPr>
+            <w:tcW w:type="dxa" w:w="960"/>
+          </w:tcPr>
+          <w:p>
+            <w:r>
+              <w:t>B</w:t>
+            </w:r>
+          </w:p>
+        </w:tc>
+        <w:tc>
+          <w:tcPr>
+            <w:tcW w:type="dxa" w:w="1440"/>
           </w:tcPr>
           <w:p>
             <w:r/>
@@ -342,7 +778,7 @@
         </w:tc>
         <w:tc>
           <w:tcPr>
-            <w:tcW w:type="dxa" w:w="2160"/>
+            <w:tcW w:type="dxa" w:w="1440"/>
           </w:tcPr>
           <w:p>
             <w:r/>
@@ -350,25 +786,183 @@
         </w:tc>
         <w:tc>
           <w:tcPr>
-            <w:tcW w:type="dxa" w:w="2160"/>
+            <w:tcW w:type="dxa" w:w="1440"/>
+          </w:tcPr>
+          <w:p>
+            <w:r/>
+          </w:p>
+        </w:tc>
+        <w:tc>
+          <w:tcPr>
+            <w:tcW w:type="dxa" w:w="960"/>
+          </w:tcPr>
+          <w:p>
+            <w:r/>
+          </w:p>
+        </w:tc>
+        <w:tc>
+          <w:tcPr>
+            <w:tcW w:type="dxa" w:w="960"/>
+          </w:tcPr>
+          <w:p>
+            <w:r/>
+          </w:p>
+        </w:tc>
+      </w:tr>
+      <w:tr>
+        <w:tc>
+          <w:tcPr>
+            <w:tcW w:type="dxa" w:w="960"/>
           </w:tcPr>
           <w:p>
             <w:r>
-              <w:t>supported / contradicted / cannot check</w:t>
+              <w:t>C</w:t>
             </w:r>
+          </w:p>
+        </w:tc>
+        <w:tc>
+          <w:tcPr>
+            <w:tcW w:type="dxa" w:w="1440"/>
+          </w:tcPr>
+          <w:p>
+            <w:r/>
+          </w:p>
+        </w:tc>
+        <w:tc>
+          <w:tcPr>
+            <w:tcW w:type="dxa" w:w="1440"/>
+          </w:tcPr>
+          <w:p>
+            <w:r/>
+          </w:p>
+        </w:tc>
+        <w:tc>
+          <w:tcPr>
+            <w:tcW w:type="dxa" w:w="1440"/>
+          </w:tcPr>
+          <w:p>
+            <w:r/>
+          </w:p>
+        </w:tc>
+        <w:tc>
+          <w:tcPr>
+            <w:tcW w:type="dxa" w:w="960"/>
+          </w:tcPr>
+          <w:p>
+            <w:r/>
+          </w:p>
+        </w:tc>
+        <w:tc>
+          <w:tcPr>
+            <w:tcW w:type="dxa" w:w="960"/>
+          </w:tcPr>
+          <w:p>
+            <w:r/>
           </w:p>
         </w:tc>
       </w:tr>
     </w:tbl>
     <w:p>
       <w:r>
-        <w:t>Part 3: Official sources (fetch them yourself, and record the source and the year)</w:t>
+        <w:rPr>
+          <w:b w:val="0"/>
+        </w:rPr>
+        <w:t>Check: does every total lie between 1 and 5? Is every calculation correct?   Yes / No</w:t>
+      </w:r>
+    </w:p>
+    <w:p>
+      <w:pPr>
+        <w:spacing w:before="200" w:after="40"/>
+      </w:pPr>
+      <w:r>
+        <w:rPr>
+          <w:b/>
+          <w:sz w:val="24"/>
+        </w:rPr>
+        <w:t>Part 4: Method review sheet</w:t>
+      </w:r>
+    </w:p>
+    <w:p>
+      <w:r>
+        <w:rPr>
+          <w:b w:val="0"/>
+        </w:rPr>
+        <w:t>1. Which three factors did we choose? Why these three? If one were replaced, how might the result change?</w:t>
+      </w:r>
+    </w:p>
+    <w:p>
+      <w:r>
+        <w:rPr>
+          <w:b w:val="0"/>
+        </w:rPr>
+        <w:t>__________________________________________________________________________</w:t>
+      </w:r>
+    </w:p>
+    <w:p>
+      <w:r>
+        <w:rPr>
+          <w:b w:val="0"/>
+        </w:rPr>
+        <w:t>2. Who set the 1-5 descriptors? Would another group score the same flat the same way? Why?</w:t>
+      </w:r>
+    </w:p>
+    <w:p>
+      <w:r>
+        <w:rPr>
+          <w:b w:val="0"/>
+        </w:rPr>
+        <w:t>__________________________________________________________________________</w:t>
+      </w:r>
+    </w:p>
+    <w:p>
+      <w:r>
+        <w:rPr>
+          <w:b w:val="0"/>
+        </w:rPr>
+        <w:t>3. The example figures are fictional. To use real figures, which official source would you go to, for which year, and which table?</w:t>
+      </w:r>
+    </w:p>
+    <w:p>
+      <w:r>
+        <w:rPr>
+          <w:b w:val="0"/>
+        </w:rPr>
+        <w:t>__________________________________________________________________________</w:t>
+      </w:r>
+    </w:p>
+    <w:p>
+      <w:r>
+        <w:rPr>
+          <w:b w:val="0"/>
+        </w:rPr>
+        <w:t>4. What is this model good for answering, and what is it not good for?</w:t>
+      </w:r>
+    </w:p>
+    <w:p>
+      <w:r>
+        <w:rPr>
+          <w:b w:val="0"/>
+        </w:rPr>
+        <w:t>__________________________________________________________________________</w:t>
+      </w:r>
+    </w:p>
+    <w:p>
+      <w:pPr>
+        <w:spacing w:before="200" w:after="40"/>
+      </w:pPr>
+      <w:r>
+        <w:rPr>
+          <w:b/>
+          <w:sz w:val="24"/>
+        </w:rPr>
+        <w:t>Official sources (for adding real figures afterwards)</w:t>
       </w:r>
     </w:p>
     <w:tbl>
       <w:tblPr>
         <w:tblStyle w:val="TableGrid"/>
         <w:tblW w:type="auto" w:w="0"/>
+        <w:tblLayout w:type="fixed"/>
         <w:tblLook w:firstColumn="1" w:firstRow="1" w:lastColumn="0" w:lastRow="0" w:noHBand="0" w:noVBand="1" w:val="04A0"/>
       </w:tblPr>
       <w:tblGrid>
@@ -378,21 +972,29 @@
       <w:tr>
         <w:tc>
           <w:tcPr>
-            <w:tcW w:type="dxa" w:w="4320"/>
+            <w:tcW w:type="dxa" w:w="2880"/>
           </w:tcPr>
           <w:p>
+            <w:r/>
             <w:r>
+              <w:rPr>
+                <w:b/>
+              </w:rPr>
               <w:t>What is being checked</w:t>
             </w:r>
           </w:p>
         </w:tc>
         <w:tc>
           <w:tcPr>
-            <w:tcW w:type="dxa" w:w="4320"/>
+            <w:tcW w:type="dxa" w:w="5760"/>
           </w:tcPr>
           <w:p>
+            <w:r/>
             <w:r>
-              <w:t>Official source</w:t>
+              <w:rPr>
+                <w:b/>
+              </w:rPr>
+              <w:t>Official source (record the year and the table number)</w:t>
             </w:r>
           </w:p>
         </w:tc>
@@ -400,7 +1002,7 @@
       <w:tr>
         <w:tc>
           <w:tcPr>
-            <w:tcW w:type="dxa" w:w="4320"/>
+            <w:tcW w:type="dxa" w:w="2880"/>
           </w:tcPr>
           <w:p>
             <w:r>
@@ -410,7 +1012,7 @@
         </w:tc>
         <w:tc>
           <w:tcPr>
-            <w:tcW w:type="dxa" w:w="4320"/>
+            <w:tcW w:type="dxa" w:w="5760"/>
           </w:tcPr>
           <w:p>
             <w:r>
@@ -422,7 +1024,7 @@
       <w:tr>
         <w:tc>
           <w:tcPr>
-            <w:tcW w:type="dxa" w:w="4320"/>
+            <w:tcW w:type="dxa" w:w="2880"/>
           </w:tcPr>
           <w:p>
             <w:r>
@@ -432,7 +1034,7 @@
         </w:tc>
         <w:tc>
           <w:tcPr>
-            <w:tcW w:type="dxa" w:w="4320"/>
+            <w:tcW w:type="dxa" w:w="5760"/>
           </w:tcPr>
           <w:p>
             <w:r>
@@ -444,7 +1046,7 @@
       <w:tr>
         <w:tc>
           <w:tcPr>
-            <w:tcW w:type="dxa" w:w="4320"/>
+            <w:tcW w:type="dxa" w:w="2880"/>
           </w:tcPr>
           <w:p>
             <w:r>
@@ -454,7 +1056,7 @@
         </w:tc>
         <w:tc>
           <w:tcPr>
-            <w:tcW w:type="dxa" w:w="4320"/>
+            <w:tcW w:type="dxa" w:w="5760"/>
           </w:tcPr>
           <w:p>
             <w:r>
@@ -465,63 +1067,107 @@
       </w:tr>
     </w:tbl>
     <w:p>
+      <w:pPr>
+        <w:spacing w:before="200" w:after="40"/>
+      </w:pPr>
       <w:r>
-        <w:t>Part 4: Redraw the comparison chart</w:t>
-      </w:r>
-    </w:p>
-    <w:p>
-      <w:r>
-        <w:t>Plot a line or bar chart from the official figures (horizontal axis: year or category; vertical axis: area or share). Label the source on the chart, then set the AI's number beside the official one so the gap is visible.</w:t>
-      </w:r>
-    </w:p>
-    <w:p>
-      <w:r>
-        <w:t>My chart shows (one sentence):</w:t>
-      </w:r>
-    </w:p>
-    <w:p>
-      <w:r>
-        <w:t>The biggest gap between the AI's account and the official figures is (one sentence):</w:t>
-      </w:r>
-    </w:p>
-    <w:p>
-      <w:r>
+        <w:rPr>
+          <w:b/>
+          <w:sz w:val="24"/>
+        </w:rPr>
         <w:t>Answer key and marking notes</w:t>
       </w:r>
     </w:p>
     <w:p>
       <w:r>
-        <w:t>What this worksheet checks is not "did the AI get it right", but "can this sentence be checked at all". The example account carries six deliberate problems:</w:t>
+        <w:rPr>
+          <w:b w:val="0"/>
+        </w:rPr>
+        <w:t>Groups may choose different factors and weights. One workable model is below:</w:t>
       </w:r>
     </w:p>
     <w:tbl>
       <w:tblPr>
         <w:tblStyle w:val="TableGrid"/>
         <w:tblW w:type="auto" w:w="0"/>
+        <w:tblLayout w:type="fixed"/>
         <w:tblLook w:firstColumn="1" w:firstRow="1" w:lastColumn="0" w:lastRow="0" w:noHBand="0" w:noVBand="1" w:val="04A0"/>
       </w:tblPr>
       <w:tblGrid>
-        <w:gridCol w:w="4320"/>
-        <w:gridCol w:w="4320"/>
+        <w:gridCol w:w="1728"/>
+        <w:gridCol w:w="1728"/>
+        <w:gridCol w:w="1728"/>
+        <w:gridCol w:w="1728"/>
+        <w:gridCol w:w="1728"/>
       </w:tblGrid>
       <w:tr>
         <w:tc>
           <w:tcPr>
-            <w:tcW w:type="dxa" w:w="4320"/>
+            <w:tcW w:type="dxa" w:w="1728"/>
           </w:tcPr>
           <w:p>
+            <w:r/>
             <w:r>
-              <w:t>Kind of problem</w:t>
+              <w:rPr>
+                <w:b/>
+              </w:rPr>
+              <w:t>Factor</w:t>
             </w:r>
           </w:p>
         </w:tc>
         <w:tc>
           <w:tcPr>
-            <w:tcW w:type="dxa" w:w="4320"/>
+            <w:tcW w:type="dxa" w:w="1728"/>
           </w:tcPr>
           <w:p>
+            <w:r/>
             <w:r>
-              <w:t>What pupils should point out</w:t>
+              <w:rPr>
+                <w:b/>
+              </w:rPr>
+              <w:t>1</w:t>
+            </w:r>
+          </w:p>
+        </w:tc>
+        <w:tc>
+          <w:tcPr>
+            <w:tcW w:type="dxa" w:w="1728"/>
+          </w:tcPr>
+          <w:p>
+            <w:r/>
+            <w:r>
+              <w:rPr>
+                <w:b/>
+              </w:rPr>
+              <w:t>3</w:t>
+            </w:r>
+          </w:p>
+        </w:tc>
+        <w:tc>
+          <w:tcPr>
+            <w:tcW w:type="dxa" w:w="1728"/>
+          </w:tcPr>
+          <w:p>
+            <w:r/>
+            <w:r>
+              <w:rPr>
+                <w:b/>
+              </w:rPr>
+              <w:t>5</w:t>
+            </w:r>
+          </w:p>
+        </w:tc>
+        <w:tc>
+          <w:tcPr>
+            <w:tcW w:type="dxa" w:w="1728"/>
+          </w:tcPr>
+          <w:p>
+            <w:r/>
+            <w:r>
+              <w:rPr>
+                <w:b/>
+              </w:rPr>
+              <w:t>Weight</w:t>
             </w:r>
           </w:p>
         </w:tc>
@@ -529,21 +1175,51 @@
       <w:tr>
         <w:tc>
           <w:tcPr>
-            <w:tcW w:type="dxa" w:w="4320"/>
+            <w:tcW w:type="dxa" w:w="1728"/>
           </w:tcPr>
           <w:p>
             <w:r>
-              <w:t>No source</w:t>
+              <w:t>Space</w:t>
             </w:r>
           </w:p>
         </w:tc>
         <w:tc>
           <w:tcPr>
-            <w:tcW w:type="dxa" w:w="4320"/>
+            <w:tcW w:type="dxa" w:w="1728"/>
           </w:tcPr>
           <w:p>
             <w:r>
-              <w:t>Nothing in the passage says where any figure comes from; a figure with no source is already the first warning sign.</w:t>
+              <w:t>30 m2 or less</w:t>
+            </w:r>
+          </w:p>
+        </w:tc>
+        <w:tc>
+          <w:tcPr>
+            <w:tcW w:type="dxa" w:w="1728"/>
+          </w:tcPr>
+          <w:p>
+            <w:r>
+              <w:t>36-40 m2</w:t>
+            </w:r>
+          </w:p>
+        </w:tc>
+        <w:tc>
+          <w:tcPr>
+            <w:tcW w:type="dxa" w:w="1728"/>
+          </w:tcPr>
+          <w:p>
+            <w:r>
+              <w:t>46 m2 or more</w:t>
+            </w:r>
+          </w:p>
+        </w:tc>
+        <w:tc>
+          <w:tcPr>
+            <w:tcW w:type="dxa" w:w="1728"/>
+          </w:tcPr>
+          <w:p>
+            <w:r>
+              <w:t>4</w:t>
             </w:r>
           </w:p>
         </w:tc>
@@ -551,21 +1227,51 @@
       <w:tr>
         <w:tc>
           <w:tcPr>
-            <w:tcW w:type="dxa" w:w="4320"/>
+            <w:tcW w:type="dxa" w:w="1728"/>
           </w:tcPr>
           <w:p>
             <w:r>
-              <w:t>An estimate stated as a fact</w:t>
+              <w:t>Rent burden</w:t>
             </w:r>
           </w:p>
         </w:tc>
         <w:tc>
           <w:tcPr>
-            <w:tcW w:type="dxa" w:w="4320"/>
+            <w:tcW w:type="dxa" w:w="1728"/>
           </w:tcPr>
           <w:p>
             <w:r>
-              <w:t>"is expected to drop to 30% by 2030" states a forecast in the present tense, confusing what has happened with what is estimated.</w:t>
+              <w:t>HK$16,000 or more</w:t>
+            </w:r>
+          </w:p>
+        </w:tc>
+        <w:tc>
+          <w:tcPr>
+            <w:tcW w:type="dxa" w:w="1728"/>
+          </w:tcPr>
+          <w:p>
+            <w:r>
+              <w:t>HK$12,000-13,999</w:t>
+            </w:r>
+          </w:p>
+        </w:tc>
+        <w:tc>
+          <w:tcPr>
+            <w:tcW w:type="dxa" w:w="1728"/>
+          </w:tcPr>
+          <w:p>
+            <w:r>
+              <w:t>HK$9,999 or less</w:t>
+            </w:r>
+          </w:p>
+        </w:tc>
+        <w:tc>
+          <w:tcPr>
+            <w:tcW w:type="dxa" w:w="1728"/>
+          </w:tcPr>
+          <w:p>
+            <w:r>
+              <w:t>4</w:t>
             </w:r>
           </w:p>
         </w:tc>
@@ -573,21 +1279,153 @@
       <w:tr>
         <w:tc>
           <w:tcPr>
-            <w:tcW w:type="dxa" w:w="4320"/>
+            <w:tcW w:type="dxa" w:w="1728"/>
           </w:tcPr>
           <w:p>
             <w:r>
-              <w:t>Inconsistent quantities and units</w:t>
+              <w:t>Commute</w:t>
             </w:r>
           </w:p>
         </w:tc>
         <w:tc>
           <w:tcPr>
-            <w:tcW w:type="dxa" w:w="4320"/>
+            <w:tcW w:type="dxa" w:w="1728"/>
           </w:tcPr>
           <w:p>
             <w:r>
-              <w:t>Square metres and square feet both appear, and no sentence says which kind of housing it means (public rental, subsidised sale or private), so the numbers cannot be compared.</w:t>
+              <w:t>45 min or more</w:t>
+            </w:r>
+          </w:p>
+        </w:tc>
+        <w:tc>
+          <w:tcPr>
+            <w:tcW w:type="dxa" w:w="1728"/>
+          </w:tcPr>
+          <w:p>
+            <w:r>
+              <w:t>25-34 min</w:t>
+            </w:r>
+          </w:p>
+        </w:tc>
+        <w:tc>
+          <w:tcPr>
+            <w:tcW w:type="dxa" w:w="1728"/>
+          </w:tcPr>
+          <w:p>
+            <w:r>
+              <w:t>14 min or less</w:t>
+            </w:r>
+          </w:p>
+        </w:tc>
+        <w:tc>
+          <w:tcPr>
+            <w:tcW w:type="dxa" w:w="1728"/>
+          </w:tcPr>
+          <w:p>
+            <w:r>
+              <w:t>2</w:t>
+            </w:r>
+          </w:p>
+        </w:tc>
+      </w:tr>
+    </w:tbl>
+    <w:tbl>
+      <w:tblPr>
+        <w:tblStyle w:val="TableGrid"/>
+        <w:tblW w:type="auto" w:w="0"/>
+        <w:tblLayout w:type="fixed"/>
+        <w:tblLook w:firstColumn="1" w:firstRow="1" w:lastColumn="0" w:lastRow="0" w:noHBand="0" w:noVBand="1" w:val="04A0"/>
+      </w:tblPr>
+      <w:tblGrid>
+        <w:gridCol w:w="1440"/>
+        <w:gridCol w:w="1440"/>
+        <w:gridCol w:w="1440"/>
+        <w:gridCol w:w="1440"/>
+        <w:gridCol w:w="1440"/>
+        <w:gridCol w:w="1440"/>
+      </w:tblGrid>
+      <w:tr>
+        <w:tc>
+          <w:tcPr>
+            <w:tcW w:type="dxa" w:w="960"/>
+          </w:tcPr>
+          <w:p>
+            <w:r/>
+            <w:r>
+              <w:rPr>
+                <w:b/>
+              </w:rPr>
+              <w:t>Option</w:t>
+            </w:r>
+          </w:p>
+        </w:tc>
+        <w:tc>
+          <w:tcPr>
+            <w:tcW w:type="dxa" w:w="720"/>
+          </w:tcPr>
+          <w:p>
+            <w:r/>
+            <w:r>
+              <w:rPr>
+                <w:b/>
+              </w:rPr>
+              <w:t>Space</w:t>
+            </w:r>
+          </w:p>
+        </w:tc>
+        <w:tc>
+          <w:tcPr>
+            <w:tcW w:type="dxa" w:w="720"/>
+          </w:tcPr>
+          <w:p>
+            <w:r/>
+            <w:r>
+              <w:rPr>
+                <w:b/>
+              </w:rPr>
+              <w:t>Rent</w:t>
+            </w:r>
+          </w:p>
+        </w:tc>
+        <w:tc>
+          <w:tcPr>
+            <w:tcW w:type="dxa" w:w="720"/>
+          </w:tcPr>
+          <w:p>
+            <w:r/>
+            <w:r>
+              <w:rPr>
+                <w:b/>
+              </w:rPr>
+              <w:t>Commute</w:t>
+            </w:r>
+          </w:p>
+        </w:tc>
+        <w:tc>
+          <w:tcPr>
+            <w:tcW w:type="dxa" w:w="3456"/>
+          </w:tcPr>
+          <w:p>
+            <w:r/>
+            <w:r>
+              <w:rPr>
+                <w:b/>
+              </w:rPr>
+              <w:t>Weighted average</w:t>
+            </w:r>
+          </w:p>
+        </w:tc>
+        <w:tc>
+          <w:tcPr>
+            <w:tcW w:type="dxa" w:w="960"/>
+          </w:tcPr>
+          <w:p>
+            <w:r/>
+            <w:r>
+              <w:rPr>
+                <w:b/>
+              </w:rPr>
+              <w:t>Total</w:t>
             </w:r>
           </w:p>
         </w:tc>
@@ -595,21 +1433,61 @@
       <w:tr>
         <w:tc>
           <w:tcPr>
-            <w:tcW w:type="dxa" w:w="4320"/>
+            <w:tcW w:type="dxa" w:w="960"/>
           </w:tcPr>
           <w:p>
             <w:r>
-              <w:t>An average presented as "typical"</w:t>
+              <w:t>A</w:t>
             </w:r>
           </w:p>
         </w:tc>
         <w:tc>
           <w:tcPr>
-            <w:tcW w:type="dxa" w:w="4320"/>
+            <w:tcW w:type="dxa" w:w="720"/>
           </w:tcPr>
           <w:p>
             <w:r>
-              <w:t>"about 16 square metres" uses one average to stand for everybody, without saying whether it is a mean or a median, or who is being averaged.</w:t>
+              <w:t>3</w:t>
+            </w:r>
+          </w:p>
+        </w:tc>
+        <w:tc>
+          <w:tcPr>
+            <w:tcW w:type="dxa" w:w="720"/>
+          </w:tcPr>
+          <w:p>
+            <w:r>
+              <w:t>3</w:t>
+            </w:r>
+          </w:p>
+        </w:tc>
+        <w:tc>
+          <w:tcPr>
+            <w:tcW w:type="dxa" w:w="720"/>
+          </w:tcPr>
+          <w:p>
+            <w:r>
+              <w:t>3</w:t>
+            </w:r>
+          </w:p>
+        </w:tc>
+        <w:tc>
+          <w:tcPr>
+            <w:tcW w:type="dxa" w:w="3456"/>
+          </w:tcPr>
+          <w:p>
+            <w:r>
+              <w:t>(3x4 + 3x4 + 3x2) / 10</w:t>
+            </w:r>
+          </w:p>
+        </w:tc>
+        <w:tc>
+          <w:tcPr>
+            <w:tcW w:type="dxa" w:w="960"/>
+          </w:tcPr>
+          <w:p>
+            <w:r>
+              <w:t>3.0</w:t>
             </w:r>
           </w:p>
         </w:tc>
@@ -617,21 +1495,61 @@
       <w:tr>
         <w:tc>
           <w:tcPr>
-            <w:tcW w:type="dxa" w:w="4320"/>
+            <w:tcW w:type="dxa" w:w="960"/>
           </w:tcPr>
           <w:p>
             <w:r>
-              <w:t>Public and private housing conflated</w:t>
+              <w:t>B</w:t>
             </w:r>
           </w:p>
         </w:tc>
         <w:tc>
           <w:tcPr>
-            <w:tcW w:type="dxa" w:w="4320"/>
+            <w:tcW w:type="dxa" w:w="720"/>
           </w:tcPr>
           <w:p>
             <w:r>
-              <w:t>"more than half of them private" does not answer "how much public housing is there"; a whole-market figure is used to answer a question about one kind of housing.</w:t>
+              <w:t>4</w:t>
+            </w:r>
+          </w:p>
+        </w:tc>
+        <w:tc>
+          <w:tcPr>
+            <w:tcW w:type="dxa" w:w="720"/>
+          </w:tcPr>
+          <w:p>
+            <w:r>
+              <w:t>2</w:t>
+            </w:r>
+          </w:p>
+        </w:tc>
+        <w:tc>
+          <w:tcPr>
+            <w:tcW w:type="dxa" w:w="720"/>
+          </w:tcPr>
+          <w:p>
+            <w:r>
+              <w:t>2</w:t>
+            </w:r>
+          </w:p>
+        </w:tc>
+        <w:tc>
+          <w:tcPr>
+            <w:tcW w:type="dxa" w:w="3456"/>
+          </w:tcPr>
+          <w:p>
+            <w:r>
+              <w:t>(4x4 + 2x4 + 2x2) / 10</w:t>
+            </w:r>
+          </w:p>
+        </w:tc>
+        <w:tc>
+          <w:tcPr>
+            <w:tcW w:type="dxa" w:w="960"/>
+          </w:tcPr>
+          <w:p>
+            <w:r>
+              <w:t>2.8</w:t>
             </w:r>
           </w:p>
         </w:tc>
@@ -639,21 +1557,61 @@
       <w:tr>
         <w:tc>
           <w:tcPr>
-            <w:tcW w:type="dxa" w:w="4320"/>
+            <w:tcW w:type="dxa" w:w="960"/>
           </w:tcPr>
           <w:p>
             <w:r>
-              <w:t>A conclusion that does not follow</w:t>
+              <w:t>C</w:t>
             </w:r>
           </w:p>
         </w:tc>
         <w:tc>
           <w:tcPr>
-            <w:tcW w:type="dxa" w:w="4320"/>
+            <w:tcW w:type="dxa" w:w="720"/>
           </w:tcPr>
           <w:p>
             <w:r>
-              <w:t>"living conditions have clearly been improving" is not derived from any figure above it; a value judgement has been written up as a finding.</w:t>
+              <w:t>2</w:t>
+            </w:r>
+          </w:p>
+        </w:tc>
+        <w:tc>
+          <w:tcPr>
+            <w:tcW w:type="dxa" w:w="720"/>
+          </w:tcPr>
+          <w:p>
+            <w:r>
+              <w:t>4</w:t>
+            </w:r>
+          </w:p>
+        </w:tc>
+        <w:tc>
+          <w:tcPr>
+            <w:tcW w:type="dxa" w:w="720"/>
+          </w:tcPr>
+          <w:p>
+            <w:r>
+              <w:t>4</w:t>
+            </w:r>
+          </w:p>
+        </w:tc>
+        <w:tc>
+          <w:tcPr>
+            <w:tcW w:type="dxa" w:w="3456"/>
+          </w:tcPr>
+          <w:p>
+            <w:r>
+              <w:t>(2x4 + 4x4 + 4x2) / 10</w:t>
+            </w:r>
+          </w:p>
+        </w:tc>
+        <w:tc>
+          <w:tcPr>
+            <w:tcW w:type="dxa" w:w="960"/>
+          </w:tcPr>
+          <w:p>
+            <w:r>
+              <w:t>3.2</w:t>
             </w:r>
           </w:p>
         </w:tc>
@@ -661,12 +1619,243 @@
     </w:tbl>
     <w:p>
       <w:r>
-        <w:t>Marking is process-based: every sentence needs an official source name and year; all three judgements must be used with a reason; the chart must be redrawn from the official figures with the source shown. Recognising "impossible to check", and saying why, is the step pupils skip and the one this lesson exists for.</w:t>
+        <w:rPr>
+          <w:b w:val="0"/>
+        </w:rPr>
+        <w:t>Ranking: C 3.2 &gt; A 3.0 &gt; B 2.8. C has the least space but the lowest rent and the shortest commute, so it comes first under these weights. A different but reasonable set of weights can change the ranking — which is exactly what the model is there to show.</w:t>
       </w:r>
     </w:p>
     <w:p>
       <w:r>
-        <w:t>This document is an independent teaching resource produced by Beets; it is not an official EDB document.</w:t>
+        <w:rPr>
+          <w:b w:val="0"/>
+        </w:rPr>
+        <w:t>Marking is process-based:</w:t>
+      </w:r>
+    </w:p>
+    <w:tbl>
+      <w:tblPr>
+        <w:tblStyle w:val="TableGrid"/>
+        <w:tblW w:type="auto" w:w="0"/>
+        <w:tblLayout w:type="fixed"/>
+        <w:tblLook w:firstColumn="1" w:firstRow="1" w:lastColumn="0" w:lastRow="0" w:noHBand="0" w:noVBand="1" w:val="04A0"/>
+      </w:tblPr>
+      <w:tblGrid>
+        <w:gridCol w:w="2880"/>
+        <w:gridCol w:w="2880"/>
+        <w:gridCol w:w="2880"/>
+      </w:tblGrid>
+      <w:tr>
+        <w:tc>
+          <w:tcPr>
+            <w:tcW w:type="dxa" w:w="1728"/>
+          </w:tcPr>
+          <w:p>
+            <w:r/>
+            <w:r>
+              <w:rPr>
+                <w:b/>
+              </w:rPr>
+              <w:t>Check item</w:t>
+            </w:r>
+          </w:p>
+        </w:tc>
+        <w:tc>
+          <w:tcPr>
+            <w:tcW w:type="dxa" w:w="3888"/>
+          </w:tcPr>
+          <w:p>
+            <w:r/>
+            <w:r>
+              <w:rPr>
+                <w:b/>
+              </w:rPr>
+              <w:t>Meets the standard</w:t>
+            </w:r>
+          </w:p>
+        </w:tc>
+        <w:tc>
+          <w:tcPr>
+            <w:tcW w:type="dxa" w:w="3024"/>
+          </w:tcPr>
+          <w:p>
+            <w:r/>
+            <w:r>
+              <w:rPr>
+                <w:b/>
+              </w:rPr>
+              <w:t>Needs work</w:t>
+            </w:r>
+          </w:p>
+        </w:tc>
+      </w:tr>
+      <w:tr>
+        <w:tc>
+          <w:tcPr>
+            <w:tcW w:type="dxa" w:w="1728"/>
+          </w:tcPr>
+          <w:p>
+            <w:r>
+              <w:t>Defining the model</w:t>
+            </w:r>
+          </w:p>
+        </w:tc>
+        <w:tc>
+          <w:tcPr>
+            <w:tcW w:type="dxa" w:w="3888"/>
+          </w:tcPr>
+          <w:p>
+            <w:r>
+              <w:t>At most three factors, written as one calculable question</w:t>
+            </w:r>
+          </w:p>
+        </w:tc>
+        <w:tc>
+          <w:tcPr>
+            <w:tcW w:type="dxa" w:w="3024"/>
+          </w:tcPr>
+          <w:p>
+            <w:r>
+              <w:t>Five or six factors, never narrowed</w:t>
+            </w:r>
+          </w:p>
+        </w:tc>
+      </w:tr>
+      <w:tr>
+        <w:tc>
+          <w:tcPr>
+            <w:tcW w:type="dxa" w:w="1728"/>
+          </w:tcPr>
+          <w:p>
+            <w:r>
+              <w:t>Scoring rules</w:t>
+            </w:r>
+          </w:p>
+        </w:tc>
+        <w:tc>
+          <w:tcPr>
+            <w:tcW w:type="dxa" w:w="3888"/>
+          </w:tcPr>
+          <w:p>
+            <w:r>
+              <w:t>Whole numbers at every level, with specific descriptors</w:t>
+            </w:r>
+          </w:p>
+        </w:tc>
+        <w:tc>
+          <w:tcPr>
+            <w:tcW w:type="dxa" w:w="3024"/>
+          </w:tcPr>
+          <w:p>
+            <w:r>
+              <w:t>"good / bad" with no definition</w:t>
+            </w:r>
+          </w:p>
+        </w:tc>
+      </w:tr>
+      <w:tr>
+        <w:tc>
+          <w:tcPr>
+            <w:tcW w:type="dxa" w:w="1728"/>
+          </w:tcPr>
+          <w:p>
+            <w:r>
+              <w:t>Weights</w:t>
+            </w:r>
+          </w:p>
+        </w:tc>
+        <w:tc>
+          <w:tcPr>
+            <w:tcW w:type="dxa" w:w="3888"/>
+          </w:tcPr>
+          <w:p>
+            <w:r>
+              <w:t>Three weights adding to 10, each with a reason</w:t>
+            </w:r>
+          </w:p>
+        </w:tc>
+        <w:tc>
+          <w:tcPr>
+            <w:tcW w:type="dxa" w:w="3024"/>
+          </w:tcPr>
+          <w:p>
+            <w:r>
+              <w:t>Weights chosen at random, or not adding to 10</w:t>
+            </w:r>
+          </w:p>
+        </w:tc>
+      </w:tr>
+      <w:tr>
+        <w:tc>
+          <w:tcPr>
+            <w:tcW w:type="dxa" w:w="1728"/>
+          </w:tcPr>
+          <w:p>
+            <w:r>
+              <w:t>Calculation</w:t>
+            </w:r>
+          </w:p>
+        </w:tc>
+        <w:tc>
+          <w:tcPr>
+            <w:tcW w:type="dxa" w:w="3888"/>
+          </w:tcPr>
+          <w:p>
+            <w:r>
+              <w:t>One weighted average, every step correct, totals within 1 to 5</w:t>
+            </w:r>
+          </w:p>
+        </w:tc>
+        <w:tc>
+          <w:tcPr>
+            <w:tcW w:type="dxa" w:w="3024"/>
+          </w:tcPr>
+          <w:p>
+            <w:r>
+              <w:t>A second formula invented, or weighted scores added straight together</w:t>
+            </w:r>
+          </w:p>
+        </w:tc>
+      </w:tr>
+      <w:tr>
+        <w:tc>
+          <w:tcPr>
+            <w:tcW w:type="dxa" w:w="1728"/>
+          </w:tcPr>
+          <w:p>
+            <w:r>
+              <w:t>Method review</w:t>
+            </w:r>
+          </w:p>
+        </w:tc>
+        <w:tc>
+          <w:tcPr>
+            <w:tcW w:type="dxa" w:w="3888"/>
+          </w:tcPr>
+          <w:p>
+            <w:r>
+              <w:t>All three limits named, plus one workable source for real figures</w:t>
+            </w:r>
+          </w:p>
+        </w:tc>
+        <w:tc>
+          <w:tcPr>
+            <w:tcW w:type="dxa" w:w="3024"/>
+          </w:tcPr>
+          <w:p>
+            <w:r>
+              <w:t>Only "the model is not accurate"</w:t>
+            </w:r>
+          </w:p>
+        </w:tc>
+      </w:tr>
+    </w:tbl>
+    <w:p>
+      <w:r>
+        <w:rPr>
+          <w:b w:val="0"/>
+        </w:rPr>
+        <w:t>Key judgement: "impossible to check" is still a legitimate answer. A figure with no source, incompatible units, or an estimate stated as a fact cannot go into the model as data. The model helps us write our thinking down clearly; it does not decide which choice is correct.</w:t>
       </w:r>
     </w:p>
     <w:sectPr>
@@ -1043,8 +2232,8 @@
     <w:qFormat/>
     <w:rsid w:val="00FC693F"/>
     <w:rPr>
-      <w:rFonts w:ascii="Calibri" w:hAnsi="Calibri"/>
-      <w:sz w:val="21"/>
+      <w:rFonts w:ascii="Noto Sans TC" w:hAnsi="Noto Sans TC"/>
+      <w:sz w:val="22"/>
     </w:rPr>
   </w:style>
   <w:style w:type="paragraph" w:styleId="Header">

</xml_diff>